<commit_message>
Update Deyan Yalamov Word document and CEO page with publication title, Plovdiv TF Fest 1st place award, and national distinctions
</commit_message>
<xml_diff>
--- a/Deyan_Yalamov_Comprehensive_Profile.docx
+++ b/Deyan_Yalamov_Comprehensive_Profile.docx
@@ -27,7 +27,7 @@
           <w:color w:val="3BB3AA"/>
           <w:sz w:val="24"/>
         </w:rPr>
-        <w:t>Founder &amp; CEO | Teaching Assistant @ FEBA | Junior Expert @ CIA | STEM Partner</w:t>
+        <w:t>Founder &amp; CEO | FEBA Teaching Assistant | Junior Expert @ CIA | STEM Partner</w:t>
       </w:r>
     </w:p>
     <w:tbl>
@@ -380,7 +380,7 @@
           <w:color w:val="21345F"/>
           <w:sz w:val="32"/>
         </w:rPr>
-        <w:t>3. INTERNATIONAL HONORS &amp; COMPETITIVE AWARDS</w:t>
+        <w:t>3. INTERNATIONAL, NATIONAL &amp; REGIONAL HONORS</w:t>
       </w:r>
     </w:p>
     <w:p>
@@ -396,6 +396,36 @@
       </w:r>
       <w:r>
         <w:t>Deyan was awarded 3rd place at the prestigious Global Innovation Challenge held in New York City, organized under PEN Worldwide. Competing against national teams representing 10 countries, Deyan co-authored and presented the winning strategic business solution for IKEA's corporate challenge, addressing global retail transformation, circular economy principles, and market expansion.</w:t>
+      </w:r>
+    </w:p>
+    <w:p>
+      <w:pPr>
+        <w:spacing w:after="120"/>
+      </w:pPr>
+      <w:r>
+        <w:rPr>
+          <w:b/>
+        </w:rPr>
+        <w:t>🥇 1st Place Award Holder — International Practice Firms Fair (TF FEST, Plovdiv)</w:t>
+        <w:br/>
+      </w:r>
+      <w:r>
+        <w:t>Awarded 1st Place for Digital Marketing Excellence and Outstanding Presentation Skills at the International Practice Firms Fair (TF FEST) in Plovdiv. Recognized for superior commercial branding, digital promotional strategy, and live executive pitch delivery.</w:t>
+      </w:r>
+    </w:p>
+    <w:p>
+      <w:pPr>
+        <w:spacing w:after="120"/>
+      </w:pPr>
+      <w:r>
+        <w:rPr>
+          <w:b/>
+        </w:rPr>
+        <w:t>🎖️ Multiple National, Regional &amp; School Distinctions</w:t>
+        <w:br/>
+      </w:r>
+      <w:r>
+        <w:t>Recipient of multiple prestigious national economic awards, regional business plan competitions, and institutional honors throughout secondary and university education, recognizing leadership in entrepreneurship, public speaking, and digital business innovation.</w:t>
       </w:r>
     </w:p>
     <w:p>
@@ -508,7 +538,74 @@
           <w:color w:val="21345F"/>
           <w:sz w:val="32"/>
         </w:rPr>
-        <w:t>5. EDUCATION &amp; ACADEMIC RESEARCH</w:t>
+        <w:t>5. ACADEMIC PUBLICATIONS &amp; FORMAL EDUCATION</w:t>
+      </w:r>
+    </w:p>
+    <w:p>
+      <w:pPr>
+        <w:keepNext/>
+        <w:spacing w:before="240" w:after="80"/>
+      </w:pPr>
+      <w:r>
+        <w:rPr>
+          <w:rFonts w:ascii="Calibri" w:hAnsi="Calibri"/>
+          <w:b/>
+          <w:color w:val="3BB3AA"/>
+          <w:sz w:val="26"/>
+        </w:rPr>
+        <w:t>Academic Publication &amp; Research Paper</w:t>
+      </w:r>
+    </w:p>
+    <w:p>
+      <w:pPr>
+        <w:spacing w:after="120"/>
+      </w:pPr>
+      <w:r>
+        <w:rPr>
+          <w:b/>
+        </w:rPr>
+        <w:t xml:space="preserve">📄 Publication Title: </w:t>
+      </w:r>
+      <w:r>
+        <w:rPr>
+          <w:b/>
+          <w:i/>
+          <w:color w:val="21345F"/>
+        </w:rPr>
+        <w:t>“Practices and Motivations for Artificial Intelligence Implementation in Bulgarian Commercial Enterprises”</w:t>
+        <w:br/>
+      </w:r>
+      <w:r>
+        <w:rPr>
+          <w:b/>
+        </w:rPr>
+        <w:t xml:space="preserve">• Bulgarian Title: </w:t>
+      </w:r>
+      <w:r>
+        <w:rPr>
+          <w:i/>
+        </w:rPr>
+        <w:t>„Практики и мотивации за използване на изкуствен интелект в българския бизнес“</w:t>
+        <w:br/>
+      </w:r>
+      <w:r>
+        <w:rPr>
+          <w:b/>
+        </w:rPr>
+        <w:t xml:space="preserve">• Institutional Context: </w:t>
+      </w:r>
+      <w:r>
+        <w:t>Faculty of Economics and Business Administration (FEBA), Sofia University 'St. Kliment Ohridski'.</w:t>
+        <w:br/>
+      </w:r>
+      <w:r>
+        <w:rPr>
+          <w:b/>
+        </w:rPr>
+        <w:t xml:space="preserve">• Research Scope: </w:t>
+      </w:r>
+      <w:r>
+        <w:t>Empirical research examining organizational adoption drivers, strategic motivations, technological barriers, and productivity outcomes of Artificial Intelligence integration within Bulgarian business enterprises.</w:t>
       </w:r>
     </w:p>
     <w:p>
@@ -538,11 +635,11 @@
         <w:br/>
       </w:r>
       <w:r>
-        <w:t>• Active participant in the European Erasmus+ project 'Learn.Inc' (Incubator for Teaching &amp; Learning through Research Projects).</w:t>
+        <w:t>• Active contributor to the European Erasmus+ project 'Learn.Inc' (Incubator for Teaching &amp; Learning through Research Projects).</w:t>
         <w:br/>
       </w:r>
       <w:r>
-        <w:t>• Author of empirical academic research analyzing the implementation motivations, organizational barriers, and practical business impacts of Artificial Intelligence adoption across Bulgarian commercial enterprises.</w:t>
+        <w:t>• Teaching Assistant for Digital Business &amp; Innovations course.</w:t>
       </w:r>
     </w:p>
     <w:p>
@@ -576,7 +673,7 @@
         <w:br/>
       </w:r>
       <w:r>
-        <w:t>• Co-founded the original student practice firm 'Interactive Studying', which served as the operational prototype for the 2026 registered commercial company.</w:t>
+        <w:t>• Co-founded the original student practice firm 'Interactive Studying', which served as the prototype for the 2026 registered commercial company.</w:t>
       </w:r>
     </w:p>
     <w:p>
@@ -755,7 +852,7 @@
               <w:rPr>
                 <w:sz w:val="19"/>
               </w:rPr>
-              <w:t>University Seminar Instruction, Academic AI Research, EU Project Coordination (CHIPS of Europe, Learn.Inc)</w:t>
+              <w:t>University Seminar Instruction, AI Business Research, Digital Marketing, EU Project Coordination (CHIPS of Europe, Learn.Inc)</w:t>
             </w:r>
           </w:p>
         </w:tc>

</xml_diff>

<commit_message>
Update exact publication title in Word document and website
</commit_message>
<xml_diff>
--- a/Deyan_Yalamov_Comprehensive_Profile.docx
+++ b/Deyan_Yalamov_Comprehensive_Profile.docx
@@ -564,7 +564,7 @@
         <w:rPr>
           <w:b/>
         </w:rPr>
-        <w:t xml:space="preserve">📄 Publication Title: </w:t>
+        <w:t xml:space="preserve">📄 Title (English): </w:t>
       </w:r>
       <w:r>
         <w:rPr>
@@ -572,20 +572,22 @@
           <w:i/>
           <w:color w:val="21345F"/>
         </w:rPr>
-        <w:t>“Practices and Motivations for Artificial Intelligence Implementation in Bulgarian Commercial Enterprises”</w:t>
+        <w:t>“From Curiosity to Competitive Advantage: Attitudes and Practices in the Use of Artificial Intelligence in Bulgarian Enterprises”</w:t>
         <w:br/>
       </w:r>
       <w:r>
         <w:rPr>
           <w:b/>
         </w:rPr>
-        <w:t xml:space="preserve">• Bulgarian Title: </w:t>
+        <w:t xml:space="preserve">📄 Title (Bulgarian): </w:t>
       </w:r>
       <w:r>
         <w:rPr>
+          <w:b/>
           <w:i/>
+          <w:color w:val="21345F"/>
         </w:rPr>
-        <w:t>„Практики и мотивации за използване на изкуствен интелект в българския бизнес“</w:t>
+        <w:t>„От любопитство към конкурентно предимство: Нагласи и практики за използване на изкуствен интелект в българските предприятия“</w:t>
         <w:br/>
       </w:r>
       <w:r>
@@ -602,10 +604,10 @@
         <w:rPr>
           <w:b/>
         </w:rPr>
-        <w:t xml:space="preserve">• Research Scope: </w:t>
+        <w:t xml:space="preserve">• Research Focus: </w:t>
       </w:r>
       <w:r>
-        <w:t>Empirical research examining organizational adoption drivers, strategic motivations, technological barriers, and productivity outcomes of Artificial Intelligence integration within Bulgarian business enterprises.</w:t>
+        <w:t>Empirical research examining enterprise AI adoption trajectories—transitioning organizational mindsets from exploratory curiosity into strategic competitive advantages across Bulgarian business sectors.</w:t>
       </w:r>
     </w:p>
     <w:p>

</xml_diff>

<commit_message>
Deploy all accumulated updates: new profile image, help email, favicons, full-width STEM section, and Bulgarian spelling
</commit_message>
<xml_diff>
--- a/Deyan_Yalamov_Comprehensive_Profile.docx
+++ b/Deyan_Yalamov_Comprehensive_Profile.docx
@@ -56,7 +56,7 @@
                 <w:color w:val="646464"/>
                 <w:sz w:val="19"/>
               </w:rPr>
-              <w:t>Email: deyan.yalamov@gmail.com</w:t>
+              <w:t>Email: deyan.yalamov@gmail.com | help@interactivestudying.eu</w:t>
               <w:br/>
               <w:t>Phone: +359 89 313 684</w:t>
               <w:br/>
@@ -79,7 +79,7 @@
                 <w:color w:val="646464"/>
                 <w:sz w:val="19"/>
               </w:rPr>
-              <w:t>Company: „Интерактив Стъдинг“ ЕООД</w:t>
+              <w:t>Company: „Интерактив Стъдийнг“ ЕООД</w:t>
               <w:br/>
               <w:t>Main Site: https://interactivestudying.eu</w:t>
               <w:br/>
@@ -117,7 +117,7 @@
         <w:spacing w:after="160" w:line="276" w:lineRule="auto"/>
       </w:pPr>
       <w:r>
-        <w:t>Deyan Yalamov is an accomplished EdTech entrepreneur, academic teaching assistant, project manager, and business administration scholar based in Sofia, Bulgaria. He serves as the Founder and General Manager of Interactive Studying („Интерактив Стъдинг“ ЕООД), a registered commercial enterprise dedicated to gamified education, digital learning modules, and innovative software solutions.</w:t>
+        <w:t>Deyan Yalamov is an accomplished EdTech entrepreneur, academic teaching assistant, project manager, and business administration scholar based in Sofia, Bulgaria. He serves as the Founder and General Manager of Interactive Studying („Интерактив Стъдийнг“ ЕООД), a registered commercial enterprise dedicated to gamified education, digital learning modules, and innovative software solutions.</w:t>
         <w:br/>
         <w:br/>
         <w:t>Alongside his commercial executive role, Deyan is a Teaching Assistant at Sofia University 'St. Kliment Ohridski' (Faculty of Economics &amp; Business Administration — FEBA), where he instructs undergraduate students in Digital Business and Innovations. He is also a Junior Expert at the Centre for Research and Analysis (ЦИА), coordinating the EU-funded 'CHIPS of Europe' initiative to foster youth engagement in microelectronics, semiconductors, and STEM disciplines. Furthermore, through Interactive Studying, Deyan is an official technology partner of Web Services, managing software and hardware installations for STEM centers across more than 20 secondary schools in Bulgaria.</w:t>
@@ -153,7 +153,7 @@
           <w:color w:val="3BB3AA"/>
           <w:sz w:val="26"/>
         </w:rPr>
-        <w:t>Founder &amp; General Manager — Interactive Studying („Интерактив Стъдинг“ ЕООД)</w:t>
+        <w:t>Founder &amp; General Manager — Interactive Studying („Интерактив Стъдийнг“ ЕООД)</w:t>
       </w:r>
     </w:p>
     <w:p>

</xml_diff>